<commit_message>
Vertragswerk: Zustimmung zur elektronischen Rechnung, Einrichtungsgebühr nach Auftragsformular, USt-IdNr. statt Steuernummer
- Rahmenvertrag § 7 und AGB § 4: neue Klausel zur Übermittlung von Rechnungen per E-Mail
  (E-Rechnung, wo gesetzlich verlangt; sonst Zustimmung zur PDF-Datei, § 14 Abs. 1 S. 5 UStG)
- "keine Setup-Gebühr" ersetzt: Einrichtungsgebühr nur, wenn im Auftragsformular vereinbart
  (Rahmenvertrag, Auftragsformular, Anlage A, AGB, Erklärfassung)
- Steuernummer-Übergangssatz durch die erteilte USt-IdNr. DE463741277 ersetzt
- Auftragsformular: Feld Rechnungs-E-Mail-Adresse; Stand Oktober 2026; Gesamtdokument neu zusammengesetzt

Co-Authored-By: Claude Opus 5.5 <noreply@anthropic.com>
</commit_message>
<xml_diff>
--- a/vertrag/01_Rahmen-Dienstleistungsvertrag.docx
+++ b/vertrag/01_Rahmen-Dienstleistungsvertrag.docx
@@ -44,7 +44,7 @@
           <w:sz w:val="18"/>
           <w:szCs w:val="18"/>
         </w:rPr>
-        <w:t xml:space="preserve">Stand: September 2026</w:t>
+        <w:t xml:space="preserve">Stand: Oktober 2026</w:t>
       </w:r>
     </w:p>
     <w:p>
@@ -2039,7 +2039,7 @@
           <w:sz w:val="21"/>
           <w:szCs w:val="21"/>
         </w:rPr>
-        <w:t xml:space="preserve">. NexAI unterliegt der Regelbesteuerung; bis zur Erteilung einer USt-IdNr. wird die Steuernummer auf der Rechnung ausgewiesen.</w:t>
+        <w:t xml:space="preserve">. NexAI unterliegt der Regelbesteuerung; die Umsatzsteuer-Identifikationsnummer von NexAI lautet DE463741277.</w:t>
       </w:r>
     </w:p>
     <w:p>
@@ -2068,33 +2068,33 @@
           <w:sz w:val="21"/>
           <w:szCs w:val="21"/>
         </w:rPr>
-        <w:t xml:space="preserve">Es wird </w:t>
-      </w:r>
-      <w:r>
-        <w:rPr>
-          <w:rFonts w:ascii="Arial" w:cs="Arial" w:eastAsia="Arial" w:hAnsi="Arial"/>
-          <w:b/>
-          <w:bCs/>
-          <w:i w:val="false"/>
-          <w:iCs w:val="false"/>
-          <w:color w:val="1A1A1A"/>
-          <w:sz w:val="21"/>
-          <w:szCs w:val="21"/>
-        </w:rPr>
-        <w:t xml:space="preserve">keine Einrichtungs-/Setup-Gebühr</w:t>
-      </w:r>
-      <w:r>
-        <w:rPr>
-          <w:rFonts w:ascii="Arial" w:cs="Arial" w:eastAsia="Arial" w:hAnsi="Arial"/>
-          <w:b w:val="false"/>
-          <w:bCs w:val="false"/>
-          <w:i w:val="false"/>
-          <w:iCs w:val="false"/>
-          <w:color w:val="1A1A1A"/>
-          <w:sz w:val="21"/>
-          <w:szCs w:val="21"/>
-        </w:rPr>
-        <w:t xml:space="preserve"> erhoben. Geschuldet ist ausschließlich ein </w:t>
+        <w:t xml:space="preserve">Eine </w:t>
+      </w:r>
+      <w:r>
+        <w:rPr>
+          <w:rFonts w:ascii="Arial" w:cs="Arial" w:eastAsia="Arial" w:hAnsi="Arial"/>
+          <w:b/>
+          <w:bCs/>
+          <w:i w:val="false"/>
+          <w:iCs w:val="false"/>
+          <w:color w:val="1A1A1A"/>
+          <w:sz w:val="21"/>
+          <w:szCs w:val="21"/>
+        </w:rPr>
+        <w:t xml:space="preserve">einmalige Einrichtungsgebühr</w:t>
+      </w:r>
+      <w:r>
+        <w:rPr>
+          <w:rFonts w:ascii="Arial" w:cs="Arial" w:eastAsia="Arial" w:hAnsi="Arial"/>
+          <w:b w:val="false"/>
+          <w:bCs w:val="false"/>
+          <w:i w:val="false"/>
+          <w:iCs w:val="false"/>
+          <w:color w:val="1A1A1A"/>
+          <w:sz w:val="21"/>
+          <w:szCs w:val="21"/>
+        </w:rPr>
+        <w:t xml:space="preserve"> fällt nur an, wenn und soweit sie im Auftragsformular vereinbart ist; sie ist mangels abweichender Vereinbarung mit der Abnahme der Einrichtung fällig. Im Übrigen ist ein </w:t>
       </w:r>
       <w:r>
         <w:rPr>
@@ -2120,7 +2120,7 @@
           <w:sz w:val="21"/>
           <w:szCs w:val="21"/>
         </w:rPr>
-        <w:t xml:space="preserve"> gemäß Auftragsformular.</w:t>
+        <w:t xml:space="preserve"> gemäß Auftragsformular geschuldet.</w:t>
       </w:r>
     </w:p>
     <w:p>
@@ -2464,6 +2464,35 @@
           <w:szCs w:val="21"/>
         </w:rPr>
         <w:t xml:space="preserve">(8)	</w:t>
+      </w:r>
+      <w:r>
+        <w:rPr>
+          <w:rFonts w:ascii="Arial" w:cs="Arial" w:eastAsia="Arial" w:hAnsi="Arial"/>
+          <w:b w:val="false"/>
+          <w:bCs w:val="false"/>
+          <w:i w:val="false"/>
+          <w:iCs w:val="false"/>
+          <w:color w:val="1A1A1A"/>
+          <w:sz w:val="21"/>
+          <w:szCs w:val="21"/>
+        </w:rPr>
+        <w:t xml:space="preserve">Rechnungen, Stornorechnungen, Zahlungserinnerungen und Mahnungen übermittelt NexAI elektronisch an die vom Kunden im Auftragsformular benannte Rechnungs-E-Mail-Adresse. Soweit NexAI gesetzlich verpflichtet ist, eine elektronische Rechnung im Sinne des § 14 Absatz 1 Satz 3 UStG auszustellen, erhält der Kunde die Rechnung in einem diesen Anforderungen entsprechenden strukturierten Format (z. B. ZUGFeRD oder XRechnung). Im Übrigen, insbesondere soweit eine Übergangsregelung eine andere Form zulässt, stimmt der Kunde der Übermittlung von Rechnungen als PDF-Datei per E-Mail zu (§ 14 Absatz 1 Satz 5 UStG). Der Kunde teilt Änderungen seiner Rechnungsanschrift und seiner Rechnungs-E-Mail-Adresse unverzüglich in Textform mit.</w:t>
+      </w:r>
+    </w:p>
+    <w:p>
+      <w:pPr>
+        <w:spacing w:after="80" w:line="276"/>
+        <w:ind w:left="360" w:hanging="360"/>
+        <w:jc w:val="both"/>
+      </w:pPr>
+      <w:r>
+        <w:rPr>
+          <w:rFonts w:ascii="Arial" w:cs="Arial" w:eastAsia="Arial" w:hAnsi="Arial"/>
+          <w:color w:val="1A1A1A"/>
+          <w:sz w:val="21"/>
+          <w:szCs w:val="21"/>
+        </w:rPr>
+        <w:t xml:space="preserve">(9)	</w:t>
       </w:r>
       <w:r>
         <w:rPr>

</xml_diff>

<commit_message>
Vertragswerk: Max' Entscheidungen 18.10. einarbeiten
- Haftungsdeckel 25.000 EUR je Schadensfall bzw. höhere Auftragssumme (RV § 12 Abs. 2, AGB § 11 Abs. 2), Klammern aufgelöst
- Verfügbarkeit 98 % (SLA Ziff. 7); [setzt voraus: externe Verfügbarkeitsmessung] bleibt
- Vertretung: Jason Brian Merklein, gleiche Erstreaktionszeiten, P1 4 Servicestunden (SLA Ziff. 2 Abs. 5)
- SLA Ziff. 3: nur die Firmennummer, ohne Personenzuordnung
- Anlage E: Lieferform fertige, signierte Programmpakete, kein Quelltext
- komplett, einfach-erklaert, README nachgezogen; neu gerendert

Co-Authored-By: Claude Opus 5.5 <noreply@anthropic.com>
</commit_message>
<xml_diff>
--- a/vertrag/01_Rahmen-Dienstleistungsvertrag.docx
+++ b/vertrag/01_Rahmen-Dienstleistungsvertrag.docx
@@ -4387,7 +4387,7 @@
           <w:sz w:val="21"/>
           <w:szCs w:val="21"/>
         </w:rPr>
-        <w:t xml:space="preserve">[25.000] EUR je Schadensfall</w:t>
+        <w:t xml:space="preserve">25.000 EUR je Schadensfall</w:t>
       </w:r>
       <w:r>
         <w:rPr>
@@ -4413,20 +4413,20 @@
           <w:sz w:val="21"/>
           <w:szCs w:val="21"/>
         </w:rPr>
-        <w:t xml:space="preserve">[die Auftragssumme]</w:t>
-      </w:r>
-      <w:r>
-        <w:rPr>
-          <w:rFonts w:ascii="Arial" w:cs="Arial" w:eastAsia="Arial" w:hAnsi="Arial"/>
-          <w:b w:val="false"/>
-          <w:bCs w:val="false"/>
-          <w:i w:val="false"/>
-          <w:iCs w:val="false"/>
-          <w:color w:val="1A1A1A"/>
-          <w:sz w:val="21"/>
-          <w:szCs w:val="21"/>
-        </w:rPr>
-        <w:t xml:space="preserve">. [Auftragssumme ist die Summe der im Einzelvertrag vereinbarten einmaligen Vergütungen und der für die ersten zwölf (12) Monate vereinbarten laufenden Vergütungen, jeweils netto.] Eine Begrenzung auf einen Jahresbetrag besteht nicht.</w:t>
+        <w:t xml:space="preserve">die Auftragssumme</w:t>
+      </w:r>
+      <w:r>
+        <w:rPr>
+          <w:rFonts w:ascii="Arial" w:cs="Arial" w:eastAsia="Arial" w:hAnsi="Arial"/>
+          <w:b w:val="false"/>
+          <w:bCs w:val="false"/>
+          <w:i w:val="false"/>
+          <w:iCs w:val="false"/>
+          <w:color w:val="1A1A1A"/>
+          <w:sz w:val="21"/>
+          <w:szCs w:val="21"/>
+        </w:rPr>
+        <w:t xml:space="preserve">. Auftragssumme ist die Summe der im Einzelvertrag vereinbarten einmaligen Vergütungen und der für die ersten zwölf (12) Monate vereinbarten laufenden Vergütungen, jeweils netto. Eine Begrenzung auf einen Jahresbetrag besteht nicht.</w:t>
       </w:r>
     </w:p>
     <w:p>

</xml_diff>

<commit_message>
Vertragswerk: Unterschrift für NexAI durch Gesellschafter allein oder Bevollmächtigte
- Rubrum aller Kundendokumente: Gesellschafter jeder allein (§ 720 Abs. 2 BGB)
  oder bevollmächtigte Person (Ziffer 16 des Leistungsscheins)
- Unterschriftsfeld NexAI: ein Feld "Name, Funktion"; Anlage D und E nur Gesellschafter
- Leistungsschein Ziffer 5: Spalten Listenpreis und vereinbarter Betrag, Hinweis zur
  Genehmigung bei Abweichung
- Ziffer 16: Hinweis zur Unterschrift für NexAI (Umfang der Vollmacht, Folgen
  bei Abweichungen, Empfang von Erklärungen nur über mbt@) mit Ankreuzfeld
- AGB § 3, Rahmenvertrag § 2, AVV: Verweis auf Ziffer 16, Vertrag erst mit
  Unterschrift beider Seiten
- alter Vertriebspartnervertrag (09) als überholt markiert
- Kurz-Erklärung und README angepasst; alles neu gerendert

Co-Authored-By: Claude Opus 5.5 <noreply@anthropic.com>
</commit_message>
<xml_diff>
--- a/vertrag/01_Rahmen-Dienstleistungsvertrag.docx
+++ b/vertrag/01_Rahmen-Dienstleistungsvertrag.docx
@@ -141,7 +141,7 @@
           <w:sz w:val="21"/>
           <w:szCs w:val="21"/>
         </w:rPr>
-        <w:t xml:space="preserve">, Untere Bergstraße 13, 74586 Frankenhardt-Honhardt, Deutschland, vertreten durch die Gesellschafter Maximilian Trenk und Jason Brian Merklein, E-Mail mbt@nex-a-i.com, Telefon 0176 80714816 — nachfolgend </w:t>
+        <w:t xml:space="preserve">, Untere Bergstraße 13, 74586 Frankenhardt-Honhardt, Deutschland, vertreten durch die Gesellschafter Maximilian Trenk und Jason Brian Merklein, jeder allein (§ 720 Abs. 2 BGB), oder durch eine bevollmächtigte Person (Ziffer 16 des Leistungsscheins), E-Mail mbt@nex-a-i.com, Telefon 0176 80714816 — nachfolgend </w:t>
       </w:r>
       <w:r>
         <w:rPr>
@@ -1010,7 +1010,7 @@
           <w:sz w:val="21"/>
           <w:szCs w:val="21"/>
         </w:rPr>
-        <w:t xml:space="preserve">Verträge kommen durch Unterzeichnung des Auftragsformulars durch beide Parteien oder durch übereinstimmende Erklärungen in Textform (§ 126b BGB) zustande. Eine qualifizierte oder fortgeschrittene elektronische Signatur im Sinne der eIDAS-Verordnung (VO (EU) Nr. 910/2014) steht der Textform gleich.</w:t>
+        <w:t xml:space="preserve">Verträge kommen durch Unterzeichnung des Auftragsformulars durch beide Parteien oder durch übereinstimmende Erklärungen in Textform (§ 126b BGB) zustande. Eine qualifizierte oder fortgeschrittene elektronische Signatur im Sinne der eIDAS-Verordnung (VO (EU) Nr. 910/2014) steht der Textform gleich. Ebenso genügt die Unterzeichnung über die Anwendung NexSign (elektronische Signatur mit Protokollseite und Siegel). Für die Unterschrift für NexAI durch bevollmächtigte Personen gilt der Hinweis zur Unterschrift in Ziffer 16 des Leistungsscheins.</w:t>
       </w:r>
     </w:p>
     <w:p>
@@ -7448,14 +7448,13 @@
         </w:tblBorders>
       </w:tblPr>
       <w:tblGrid>
-        <w:gridCol w:w="3135"/>
-        <w:gridCol w:w="3135"/>
-        <w:gridCol w:w="3135"/>
+        <w:gridCol w:w="4703"/>
+        <w:gridCol w:w="4703"/>
       </w:tblGrid>
       <w:tr>
         <w:tc>
           <w:tcPr>
-            <w:tcW w:type="dxa" w:w="3135"/>
+            <w:tcW w:type="dxa" w:w="4703"/>
             <w:tcBorders>
               <w:top w:val="none" w:color="FFFFFF" w:sz="0"/>
               <w:left w:val="none" w:color="FFFFFF" w:sz="0"/>
@@ -7546,110 +7545,13 @@
                 <w:sz w:val="18"/>
                 <w:szCs w:val="18"/>
               </w:rPr>
-              <w:t xml:space="preserve">Maximilian Trenk (Gesellschafter)</w:t>
+              <w:t xml:space="preserve">Name, Funktion (Gesellschafter oder in Vollmacht für NexAI)</w:t>
             </w:r>
           </w:p>
         </w:tc>
         <w:tc>
           <w:tcPr>
-            <w:tcW w:type="dxa" w:w="3135"/>
-            <w:tcBorders>
-              <w:top w:val="none" w:color="FFFFFF" w:sz="0"/>
-              <w:left w:val="none" w:color="FFFFFF" w:sz="0"/>
-              <w:bottom w:val="none" w:color="FFFFFF" w:sz="0"/>
-              <w:right w:val="none" w:color="FFFFFF" w:sz="0"/>
-            </w:tcBorders>
-            <w:tcMar>
-              <w:top w:type="dxa" w:w="60"/>
-              <w:right w:type="dxa" w:w="160"/>
-            </w:tcMar>
-          </w:tcPr>
-          <w:p>
-            <w:pPr>
-              <w:spacing w:after="0"/>
-            </w:pPr>
-            <w:r>
-              <w:rPr>
-                <w:rFonts w:ascii="Arial" w:cs="Arial" w:eastAsia="Arial" w:hAnsi="Arial"/>
-                <w:b/>
-                <w:bCs/>
-                <w:i w:val="false"/>
-                <w:iCs w:val="false"/>
-                <w:color w:val="0B0B0F"/>
-                <w:sz w:val="19"/>
-                <w:szCs w:val="19"/>
-              </w:rPr>
-              <w:t xml:space="preserve">Für NexAI</w:t>
-            </w:r>
-          </w:p>
-          <w:p>
-            <w:pPr>
-              <w:pBdr>
-                <w:bottom w:val="single" w:color="9CA3AF" w:sz="6" w:space="2"/>
-              </w:pBdr>
-              <w:spacing w:after="0" w:before="360"/>
-            </w:pPr>
-            <w:r>
-              <w:rPr>
-                <w:sz w:val="2"/>
-                <w:szCs w:val="2"/>
-              </w:rPr>
-              <w:t xml:space="preserve"/>
-            </w:r>
-          </w:p>
-          <w:p>
-            <w:pPr>
-              <w:spacing w:after="20"/>
-            </w:pPr>
-            <w:r>
-              <w:rPr>
-                <w:rFonts w:ascii="Arial" w:cs="Arial" w:eastAsia="Arial" w:hAnsi="Arial"/>
-                <w:b w:val="false"/>
-                <w:bCs w:val="false"/>
-                <w:i w:val="false"/>
-                <w:iCs w:val="false"/>
-                <w:color w:val="6B7280"/>
-                <w:sz w:val="18"/>
-                <w:szCs w:val="18"/>
-              </w:rPr>
-              <w:t xml:space="preserve">Ort, Datum</w:t>
-            </w:r>
-          </w:p>
-          <w:p>
-            <w:pPr>
-              <w:spacing w:after="20"/>
-            </w:pPr>
-            <w:r>
-              <w:rPr>
-                <w:rFonts w:ascii="Arial" w:cs="Arial" w:eastAsia="Arial" w:hAnsi="Arial"/>
-                <w:sz w:val="18"/>
-                <w:szCs w:val="18"/>
-              </w:rPr>
-              <w:t xml:space="preserve"/>
-            </w:r>
-          </w:p>
-          <w:p>
-            <w:pPr>
-              <w:spacing w:after="20"/>
-            </w:pPr>
-            <w:r>
-              <w:rPr>
-                <w:rFonts w:ascii="Arial" w:cs="Arial" w:eastAsia="Arial" w:hAnsi="Arial"/>
-                <w:b w:val="false"/>
-                <w:bCs w:val="false"/>
-                <w:i w:val="false"/>
-                <w:iCs w:val="false"/>
-                <w:color w:val="1A1A1A"/>
-                <w:sz w:val="18"/>
-                <w:szCs w:val="18"/>
-              </w:rPr>
-              <w:t xml:space="preserve">Jason Brian Merklein (Gesellschafter)</w:t>
-            </w:r>
-          </w:p>
-        </w:tc>
-        <w:tc>
-          <w:tcPr>
-            <w:tcW w:type="dxa" w:w="3135"/>
+            <w:tcW w:type="dxa" w:w="4703"/>
             <w:tcBorders>
               <w:top w:val="none" w:color="FFFFFF" w:sz="0"/>
               <w:left w:val="none" w:color="FFFFFF" w:sz="0"/>

</xml_diff>